<commit_message>
Log book, Poster, group evaluation
</commit_message>
<xml_diff>
--- a/FinalProject_Learn/Selfevaluation_group.docx
+++ b/FinalProject_Learn/Selfevaluation_group.docx
@@ -108,7 +108,15 @@
           <w:sz w:val="28"/>
           <w:szCs w:val="24"/>
         </w:rPr>
-        <w:t>Group: __________________</w:t>
+        <w:t xml:space="preserve">Group: </w:t>
+      </w:r>
+      <w:r>
+        <w:rPr>
+          <w:b/>
+          <w:sz w:val="28"/>
+          <w:szCs w:val="24"/>
+        </w:rPr>
+        <w:t>16</w:t>
       </w:r>
     </w:p>
     <w:p>
@@ -230,6 +238,13 @@
                 <w:szCs w:val="24"/>
               </w:rPr>
             </w:pPr>
+            <w:r>
+              <w:rPr>
+                <w:sz w:val="24"/>
+                <w:szCs w:val="24"/>
+              </w:rPr>
+              <w:t>X</w:t>
+            </w:r>
           </w:p>
         </w:tc>
         <w:tc>
@@ -278,6 +293,13 @@
                 <w:szCs w:val="24"/>
               </w:rPr>
             </w:pPr>
+            <w:r>
+              <w:rPr>
+                <w:sz w:val="24"/>
+                <w:szCs w:val="24"/>
+              </w:rPr>
+              <w:t>X</w:t>
+            </w:r>
           </w:p>
         </w:tc>
         <w:tc>
@@ -326,6 +348,13 @@
                 <w:szCs w:val="24"/>
               </w:rPr>
             </w:pPr>
+            <w:r>
+              <w:rPr>
+                <w:sz w:val="24"/>
+                <w:szCs w:val="24"/>
+              </w:rPr>
+              <w:t>X</w:t>
+            </w:r>
           </w:p>
         </w:tc>
         <w:tc>
@@ -374,6 +403,13 @@
                 <w:szCs w:val="24"/>
               </w:rPr>
             </w:pPr>
+            <w:r>
+              <w:rPr>
+                <w:sz w:val="24"/>
+                <w:szCs w:val="24"/>
+              </w:rPr>
+              <w:t>X</w:t>
+            </w:r>
           </w:p>
         </w:tc>
         <w:tc>
@@ -422,6 +458,13 @@
                 <w:szCs w:val="24"/>
               </w:rPr>
             </w:pPr>
+            <w:r>
+              <w:rPr>
+                <w:sz w:val="24"/>
+                <w:szCs w:val="24"/>
+              </w:rPr>
+              <w:t>X</w:t>
+            </w:r>
           </w:p>
         </w:tc>
         <w:tc>
@@ -470,6 +513,13 @@
                 <w:szCs w:val="24"/>
               </w:rPr>
             </w:pPr>
+            <w:r>
+              <w:rPr>
+                <w:sz w:val="24"/>
+                <w:szCs w:val="24"/>
+              </w:rPr>
+              <w:t>X</w:t>
+            </w:r>
           </w:p>
         </w:tc>
         <w:tc>
@@ -518,6 +568,13 @@
                 <w:szCs w:val="24"/>
               </w:rPr>
             </w:pPr>
+            <w:r>
+              <w:rPr>
+                <w:sz w:val="24"/>
+                <w:szCs w:val="24"/>
+              </w:rPr>
+              <w:t>X</w:t>
+            </w:r>
           </w:p>
         </w:tc>
         <w:tc>
@@ -639,7 +696,11 @@
           <w:tcPr>
             <w:tcW w:w="1843" w:type="dxa"/>
           </w:tcPr>
-          <w:p/>
+          <w:p>
+            <w:r>
+              <w:t>X</w:t>
+            </w:r>
+          </w:p>
         </w:tc>
         <w:tc>
           <w:tcPr>
@@ -664,7 +725,10 @@
               <w:t>analog sensor (write which</w:t>
             </w:r>
             <w:r>
-              <w:t xml:space="preserve">:                                                  </w:t>
+              <w:t>:</w:t>
+            </w:r>
+            <w:r>
+              <w:t xml:space="preserve"> LM35</w:t>
             </w:r>
             <w:r>
               <w:t>)</w:t>
@@ -675,7 +739,11 @@
           <w:tcPr>
             <w:tcW w:w="1843" w:type="dxa"/>
           </w:tcPr>
-          <w:p/>
+          <w:p>
+            <w:r>
+              <w:t>X</w:t>
+            </w:r>
+          </w:p>
         </w:tc>
         <w:tc>
           <w:tcPr>
@@ -691,7 +759,13 @@
           </w:tcPr>
           <w:p>
             <w:r>
-              <w:t>Min 1 digital sensor (write which:                                                   )</w:t>
+              <w:t>Min 1 digital sensor (write which:</w:t>
+            </w:r>
+            <w:r>
+              <w:t xml:space="preserve"> HC-SR04</w:t>
+            </w:r>
+            <w:r>
+              <w:t>)</w:t>
             </w:r>
           </w:p>
         </w:tc>
@@ -699,7 +773,11 @@
           <w:tcPr>
             <w:tcW w:w="1843" w:type="dxa"/>
           </w:tcPr>
-          <w:p/>
+          <w:p>
+            <w:r>
+              <w:t>X</w:t>
+            </w:r>
+          </w:p>
         </w:tc>
         <w:tc>
           <w:tcPr>
@@ -715,7 +793,21 @@
           </w:tcPr>
           <w:p>
             <w:r>
-              <w:t>Min 1 actuation (write which:                                                          )</w:t>
+              <w:t>Min 1 actuation (write which:</w:t>
+            </w:r>
+            <w:r>
+              <w:t xml:space="preserve"> 2 </w:t>
+            </w:r>
+            <w:proofErr w:type="spellStart"/>
+            <w:r>
+              <w:t>steppermotors</w:t>
+            </w:r>
+            <w:proofErr w:type="spellEnd"/>
+            <w:r>
+              <w:t xml:space="preserve"> (from the kit)</w:t>
+            </w:r>
+            <w:r>
+              <w:t>)</w:t>
             </w:r>
           </w:p>
         </w:tc>
@@ -723,7 +815,11 @@
           <w:tcPr>
             <w:tcW w:w="1843" w:type="dxa"/>
           </w:tcPr>
-          <w:p/>
+          <w:p>
+            <w:r>
+              <w:t>X</w:t>
+            </w:r>
+          </w:p>
         </w:tc>
         <w:tc>
           <w:tcPr>
@@ -739,7 +835,13 @@
           </w:tcPr>
           <w:p>
             <w:r>
-              <w:t>Uses display (which form:                                                                 )</w:t>
+              <w:t>Uses display (which form:</w:t>
+            </w:r>
+            <w:r>
+              <w:t xml:space="preserve"> OLED 1.54”</w:t>
+            </w:r>
+            <w:r>
+              <w:t>)</w:t>
             </w:r>
           </w:p>
         </w:tc>
@@ -747,7 +849,11 @@
           <w:tcPr>
             <w:tcW w:w="1843" w:type="dxa"/>
           </w:tcPr>
-          <w:p/>
+          <w:p>
+            <w:r>
+              <w:t>X</w:t>
+            </w:r>
+          </w:p>
         </w:tc>
         <w:tc>
           <w:tcPr>
@@ -776,7 +882,11 @@
           <w:tcPr>
             <w:tcW w:w="1843" w:type="dxa"/>
           </w:tcPr>
-          <w:p/>
+          <w:p>
+            <w:r>
+              <w:t>X</w:t>
+            </w:r>
+          </w:p>
         </w:tc>
         <w:tc>
           <w:tcPr>
@@ -800,7 +910,11 @@
           <w:tcPr>
             <w:tcW w:w="1843" w:type="dxa"/>
           </w:tcPr>
-          <w:p/>
+          <w:p>
+            <w:r>
+              <w:t>x</w:t>
+            </w:r>
+          </w:p>
         </w:tc>
         <w:tc>
           <w:tcPr>
@@ -1739,6 +1853,51 @@
           <w:b/>
         </w:rPr>
       </w:pPr>
+      <w:r>
+        <w:rPr>
+          <w:b/>
+        </w:rPr>
+        <w:br/>
+      </w:r>
+    </w:p>
+    <w:p>
+      <w:pPr>
+        <w:rPr>
+          <w:b/>
+        </w:rPr>
+      </w:pPr>
+      <w:r>
+        <w:rPr>
+          <w:b/>
+        </w:rPr>
+        <w:t>General c</w:t>
+      </w:r>
+      <w:r>
+        <w:rPr>
+          <w:b/>
+        </w:rPr>
+        <w:t>omments about the poster:</w:t>
+      </w:r>
+    </w:p>
+    <w:p>
+      <w:pPr>
+        <w:rPr>
+          <w:bCs/>
+        </w:rPr>
+      </w:pPr>
+      <w:r>
+        <w:rPr>
+          <w:bCs/>
+        </w:rPr>
+        <w:t>The poster was fulfilling and gave an easy-to-read understanding of our project.</w:t>
+      </w:r>
+      <w:r>
+        <w:rPr>
+          <w:bCs/>
+        </w:rPr>
+        <w:br/>
+        <w:t>Maybe a bit to technical, but the easy layout made up for it in our opinion.</w:t>
+      </w:r>
     </w:p>
     <w:p>
       <w:pPr>
@@ -1763,7 +1922,20 @@
         <w:rPr>
           <w:b/>
         </w:rPr>
-        <w:t>omments about the poster:</w:t>
+        <w:t>omments about the prototype:</w:t>
+      </w:r>
+    </w:p>
+    <w:p>
+      <w:pPr>
+        <w:rPr>
+          <w:bCs/>
+        </w:rPr>
+      </w:pPr>
+      <w:r>
+        <w:rPr>
+          <w:bCs/>
+        </w:rPr>
+        <w:t>Prototype is working as intended, but we learned through the process of several improvements to be done in the future. Both design/mechanical-wise and on extra features.</w:t>
       </w:r>
     </w:p>
     <w:p>
@@ -1779,13 +1951,6 @@
           <w:b/>
         </w:rPr>
       </w:pPr>
-    </w:p>
-    <w:p>
-      <w:pPr>
-        <w:rPr>
-          <w:b/>
-        </w:rPr>
-      </w:pPr>
       <w:r>
         <w:rPr>
           <w:b/>
@@ -1796,7 +1961,7 @@
         <w:rPr>
           <w:b/>
         </w:rPr>
-        <w:t>omments about the prototype:</w:t>
+        <w:t>omments about the log-book:</w:t>
       </w:r>
     </w:p>
     <w:p>
@@ -1823,19 +1988,83 @@
         <w:rPr>
           <w:b/>
         </w:rPr>
-        <w:t>General c</w:t>
-      </w:r>
-      <w:r>
-        <w:rPr>
-          <w:b/>
-        </w:rPr>
-        <w:t>omments about the log-book:</w:t>
+        <w:lastRenderedPageBreak/>
+        <w:t>General comments about our</w:t>
+      </w:r>
+      <w:r>
+        <w:rPr>
+          <w:b/>
+        </w:rPr>
+        <w:t xml:space="preserve"> group</w:t>
+      </w:r>
+      <w:r>
+        <w:rPr>
+          <w:b/>
+        </w:rPr>
+        <w:t xml:space="preserve"> and our</w:t>
+      </w:r>
+      <w:r>
+        <w:rPr>
+          <w:b/>
+        </w:rPr>
+        <w:t xml:space="preserve"> working methodology</w:t>
+      </w:r>
+      <w:r>
+        <w:rPr>
+          <w:b/>
+        </w:rPr>
+        <w:t>:</w:t>
       </w:r>
     </w:p>
     <w:p>
       <w:pPr>
         <w:rPr>
-          <w:b/>
+          <w:bCs/>
+        </w:rPr>
+      </w:pPr>
+      <w:r>
+        <w:rPr>
+          <w:bCs/>
+        </w:rPr>
+        <w:t>We believe that we have all contributed equally, there has been a good teamwork throughout the process. And we have all had a lot of fun with the project.</w:t>
+      </w:r>
+      <w:r>
+        <w:rPr>
+          <w:bCs/>
+        </w:rPr>
+        <w:br/>
+      </w:r>
+    </w:p>
+    <w:p>
+      <w:pPr>
+        <w:rPr>
+          <w:b/>
+        </w:rPr>
+      </w:pPr>
+      <w:r>
+        <w:rPr>
+          <w:b/>
+        </w:rPr>
+        <w:t xml:space="preserve">How many members were in the group:            </w:t>
+      </w:r>
+    </w:p>
+    <w:p>
+      <w:pPr>
+        <w:rPr>
+          <w:bCs/>
+        </w:rPr>
+      </w:pPr>
+      <w:r>
+        <w:rPr>
+          <w:bCs/>
+        </w:rPr>
+        <w:t>6</w:t>
+      </w:r>
+    </w:p>
+    <w:p>
+      <w:pPr>
+        <w:rPr>
+          <w:bCs/>
         </w:rPr>
       </w:pPr>
     </w:p>
@@ -1845,62 +2074,100 @@
           <w:b/>
         </w:rPr>
       </w:pPr>
+      <w:r>
+        <w:rPr>
+          <w:b/>
+        </w:rPr>
+        <w:t>If the group had 100 to</w:t>
+      </w:r>
+      <w:r>
+        <w:rPr>
+          <w:b/>
+        </w:rPr>
+        <w:t>kens to distribute amongst them</w:t>
+      </w:r>
+      <w:r>
+        <w:rPr>
+          <w:b/>
+        </w:rPr>
+        <w:t xml:space="preserve"> to </w:t>
+      </w:r>
+      <w:proofErr w:type="spellStart"/>
+      <w:r>
+        <w:rPr>
+          <w:b/>
+        </w:rPr>
+        <w:t>honour</w:t>
+      </w:r>
+      <w:proofErr w:type="spellEnd"/>
+      <w:r>
+        <w:rPr>
+          <w:b/>
+        </w:rPr>
+        <w:t xml:space="preserve"> the </w:t>
+      </w:r>
+      <w:r>
+        <w:rPr>
+          <w:b/>
+        </w:rPr>
+        <w:t xml:space="preserve">overall </w:t>
+      </w:r>
+      <w:r>
+        <w:rPr>
+          <w:b/>
+        </w:rPr>
+        <w:t>contribution to the project, how would they be distributed amongst the group members:</w:t>
+      </w:r>
+    </w:p>
+    <w:p>
+      <w:r>
+        <w:t xml:space="preserve">Equally </w:t>
+      </w:r>
+      <w:r>
+        <w:sym w:font="Wingdings" w:char="F04A"/>
+      </w:r>
+      <w:r>
+        <w:br/>
+        <w:t xml:space="preserve">All 6 of us contribute very positively to each other’s strengths and weaknesses </w:t>
+      </w:r>
+    </w:p>
+    <w:p/>
+    <w:p>
+      <w:pPr>
+        <w:rPr>
+          <w:b/>
+        </w:rPr>
+      </w:pPr>
+      <w:r>
+        <w:rPr>
+          <w:b/>
+        </w:rPr>
+        <w:t>Is this distribution consistent with the distribution of tasks described in the report?</w:t>
+      </w:r>
     </w:p>
     <w:p>
       <w:pPr>
         <w:rPr>
-          <w:b/>
+          <w:bCs/>
         </w:rPr>
       </w:pPr>
       <w:r>
         <w:rPr>
-          <w:b/>
-        </w:rPr>
-        <w:t>General comments about our</w:t>
-      </w:r>
-      <w:r>
-        <w:rPr>
-          <w:b/>
-        </w:rPr>
-        <w:t xml:space="preserve"> group</w:t>
-      </w:r>
-      <w:r>
-        <w:rPr>
-          <w:b/>
-        </w:rPr>
-        <w:t xml:space="preserve"> and our</w:t>
-      </w:r>
-      <w:r>
-        <w:rPr>
-          <w:b/>
-        </w:rPr>
-        <w:t xml:space="preserve"> working methodology</w:t>
-      </w:r>
-      <w:r>
-        <w:rPr>
-          <w:b/>
-        </w:rPr>
-        <w:t>:</w:t>
+          <w:bCs/>
+        </w:rPr>
+        <w:t>Y</w:t>
+      </w:r>
+      <w:r>
+        <w:rPr>
+          <w:bCs/>
+        </w:rPr>
+        <w:t>es</w:t>
       </w:r>
     </w:p>
     <w:p>
       <w:pPr>
         <w:rPr>
-          <w:b/>
-        </w:rPr>
-      </w:pPr>
-      <w:r>
-        <w:rPr>
-          <w:b/>
-        </w:rPr>
-        <w:lastRenderedPageBreak/>
-        <w:t xml:space="preserve">How many members were in the group:            </w:t>
-      </w:r>
-    </w:p>
-    <w:p>
-      <w:pPr>
-        <w:rPr>
-          <w:b/>
+          <w:bCs/>
         </w:rPr>
       </w:pPr>
     </w:p>
@@ -1914,149 +2181,10 @@
         <w:rPr>
           <w:b/>
         </w:rPr>
-        <w:t>If the group had 100 to</w:t>
-      </w:r>
-      <w:r>
-        <w:rPr>
-          <w:b/>
-        </w:rPr>
-        <w:t>kens to distribute amongst them</w:t>
-      </w:r>
-      <w:r>
-        <w:rPr>
-          <w:b/>
-        </w:rPr>
-        <w:t xml:space="preserve"> to </w:t>
-      </w:r>
-      <w:proofErr w:type="spellStart"/>
-      <w:r>
-        <w:rPr>
-          <w:b/>
-        </w:rPr>
-        <w:t>honour</w:t>
-      </w:r>
-      <w:proofErr w:type="spellEnd"/>
-      <w:r>
-        <w:rPr>
-          <w:b/>
-        </w:rPr>
-        <w:t xml:space="preserve"> the </w:t>
-      </w:r>
-      <w:r>
-        <w:rPr>
-          <w:b/>
-        </w:rPr>
-        <w:t xml:space="preserve">overall </w:t>
-      </w:r>
-      <w:r>
-        <w:rPr>
-          <w:b/>
-        </w:rPr>
-        <w:t>contribution to the project, how would they be distributed amongst the group members:</w:t>
+        <w:t>If not, please explain the deviation.</w:t>
       </w:r>
     </w:p>
     <w:p/>
-    <w:p/>
-    <w:p>
-      <w:pPr>
-        <w:rPr>
-          <w:b/>
-        </w:rPr>
-      </w:pPr>
-      <w:r>
-        <w:rPr>
-          <w:b/>
-        </w:rPr>
-        <w:t>Is this distribution consistent with the distribution of tasks described in the report?</w:t>
-      </w:r>
-    </w:p>
-    <w:p>
-      <w:pPr>
-        <w:rPr>
-          <w:b/>
-        </w:rPr>
-      </w:pPr>
-      <w:r>
-        <w:rPr>
-          <w:b/>
-        </w:rPr>
-        <w:t>If not, please explain the deviation.</w:t>
-      </w:r>
-    </w:p>
-    <w:p/>
-    <w:p/>
-    <w:p>
-      <w:pPr>
-        <w:rPr>
-          <w:b/>
-        </w:rPr>
-      </w:pPr>
-      <w:r>
-        <w:rPr>
-          <w:b/>
-        </w:rPr>
-        <w:t>*****************************************************************************</w:t>
-      </w:r>
-    </w:p>
-    <w:p>
-      <w:pPr>
-        <w:rPr>
-          <w:b/>
-          <w:sz w:val="28"/>
-          <w:szCs w:val="24"/>
-        </w:rPr>
-      </w:pPr>
-      <w:proofErr w:type="spellStart"/>
-      <w:r>
-        <w:rPr>
-          <w:b/>
-          <w:sz w:val="28"/>
-          <w:szCs w:val="24"/>
-        </w:rPr>
-        <w:t>Self evaluation</w:t>
-      </w:r>
-      <w:proofErr w:type="spellEnd"/>
-      <w:r>
-        <w:rPr>
-          <w:b/>
-          <w:sz w:val="28"/>
-          <w:szCs w:val="24"/>
-        </w:rPr>
-        <w:t xml:space="preserve"> (Individual part)   </w:t>
-      </w:r>
-      <w:r>
-        <w:rPr>
-          <w:b/>
-          <w:sz w:val="28"/>
-          <w:szCs w:val="24"/>
-        </w:rPr>
-        <w:t xml:space="preserve">                   </w:t>
-      </w:r>
-      <w:r>
-        <w:rPr>
-          <w:b/>
-          <w:sz w:val="28"/>
-          <w:szCs w:val="24"/>
-        </w:rPr>
-        <w:t xml:space="preserve">  </w:t>
-      </w:r>
-      <w:r>
-        <w:rPr>
-          <w:b/>
-          <w:sz w:val="28"/>
-          <w:szCs w:val="24"/>
-        </w:rPr>
-        <w:br/>
-      </w:r>
-      <w:r>
-        <w:rPr>
-          <w:b/>
-          <w:sz w:val="28"/>
-          <w:szCs w:val="24"/>
-        </w:rPr>
-        <w:t>Student name and number: __________________</w:t>
-      </w:r>
-    </w:p>
     <w:sectPr>
       <w:pgSz w:w="12240" w:h="15840"/>
       <w:pgMar w:top="1440" w:right="1440" w:bottom="1440" w:left="1440" w:header="708" w:footer="708" w:gutter="0"/>

</xml_diff>

<commit_message>
Add power-budget paragraph, clean Arduino comments, fill self-evaluations
- Hardware design: short power-budget paragraph summarising the MATLAB
  battery-life analysis (qualitative, no figure)
- sketch_apr16a.ino / Temp_ref.ino: comments to short English, fix
  broken/typo comments, keep the non-obvious WHY notes, code unchanged
- Self evaluation 34315_Anders.docx: draft "General comments about my
  work", complete the cut-off sentence, fix "Higlights" typo
- Selfevaluation_group.docx: fill the report-content table (12 Good,
  3 Excellent) and the "General comments about the report" field
</commit_message>
<xml_diff>
--- a/FinalProject_Learn/Selfevaluation_group.docx
+++ b/FinalProject_Learn/Selfevaluation_group.docx
@@ -1101,7 +1101,22 @@
           <w:tcPr>
             <w:tcW w:w="851" w:type="dxa"/>
           </w:tcPr>
-          <w:p/>
+          <w:p>
+            <w:pPr>
+              <w:jc w:val="center"/>
+              <w:rPr>
+                <w:sz w:val="24"/>
+                <w:szCs w:val="24"/>
+              </w:rPr>
+            </w:pPr>
+            <w:r>
+              <w:rPr>
+                <w:sz w:val="24"/>
+                <w:szCs w:val="24"/>
+              </w:rPr>
+              <w:t>X</w:t>
+            </w:r>
+          </w:p>
         </w:tc>
         <w:tc>
           <w:tcPr>
@@ -1137,7 +1152,22 @@
           <w:tcPr>
             <w:tcW w:w="851" w:type="dxa"/>
           </w:tcPr>
-          <w:p/>
+          <w:p>
+            <w:pPr>
+              <w:jc w:val="center"/>
+              <w:rPr>
+                <w:sz w:val="24"/>
+                <w:szCs w:val="24"/>
+              </w:rPr>
+            </w:pPr>
+            <w:r>
+              <w:rPr>
+                <w:sz w:val="24"/>
+                <w:szCs w:val="24"/>
+              </w:rPr>
+              <w:t>X</w:t>
+            </w:r>
+          </w:p>
         </w:tc>
         <w:tc>
           <w:tcPr>
@@ -1173,7 +1203,22 @@
           <w:tcPr>
             <w:tcW w:w="851" w:type="dxa"/>
           </w:tcPr>
-          <w:p/>
+          <w:p>
+            <w:pPr>
+              <w:jc w:val="center"/>
+              <w:rPr>
+                <w:sz w:val="24"/>
+                <w:szCs w:val="24"/>
+              </w:rPr>
+            </w:pPr>
+            <w:r>
+              <w:rPr>
+                <w:sz w:val="24"/>
+                <w:szCs w:val="24"/>
+              </w:rPr>
+              <w:t>X</w:t>
+            </w:r>
+          </w:p>
         </w:tc>
         <w:tc>
           <w:tcPr>
@@ -1264,7 +1309,22 @@
           <w:tcPr>
             <w:tcW w:w="851" w:type="dxa"/>
           </w:tcPr>
-          <w:p/>
+          <w:p>
+            <w:pPr>
+              <w:jc w:val="center"/>
+              <w:rPr>
+                <w:sz w:val="24"/>
+                <w:szCs w:val="24"/>
+              </w:rPr>
+            </w:pPr>
+            <w:r>
+              <w:rPr>
+                <w:sz w:val="24"/>
+                <w:szCs w:val="24"/>
+              </w:rPr>
+              <w:t>X</w:t>
+            </w:r>
+          </w:p>
         </w:tc>
         <w:tc>
           <w:tcPr>
@@ -1300,7 +1360,22 @@
           <w:tcPr>
             <w:tcW w:w="851" w:type="dxa"/>
           </w:tcPr>
-          <w:p/>
+          <w:p>
+            <w:pPr>
+              <w:jc w:val="center"/>
+              <w:rPr>
+                <w:sz w:val="24"/>
+                <w:szCs w:val="24"/>
+              </w:rPr>
+            </w:pPr>
+            <w:r>
+              <w:rPr>
+                <w:sz w:val="24"/>
+                <w:szCs w:val="24"/>
+              </w:rPr>
+              <w:t>X</w:t>
+            </w:r>
+          </w:p>
         </w:tc>
         <w:tc>
           <w:tcPr>
@@ -1339,7 +1414,22 @@
           <w:tcPr>
             <w:tcW w:w="851" w:type="dxa"/>
           </w:tcPr>
-          <w:p/>
+          <w:p>
+            <w:pPr>
+              <w:jc w:val="center"/>
+              <w:rPr>
+                <w:sz w:val="24"/>
+                <w:szCs w:val="24"/>
+              </w:rPr>
+            </w:pPr>
+            <w:r>
+              <w:rPr>
+                <w:sz w:val="24"/>
+                <w:szCs w:val="24"/>
+              </w:rPr>
+              <w:t>X</w:t>
+            </w:r>
+          </w:p>
         </w:tc>
         <w:tc>
           <w:tcPr>
@@ -1425,7 +1515,22 @@
           <w:tcPr>
             <w:tcW w:w="851" w:type="dxa"/>
           </w:tcPr>
-          <w:p/>
+          <w:p>
+            <w:pPr>
+              <w:jc w:val="center"/>
+              <w:rPr>
+                <w:sz w:val="24"/>
+                <w:szCs w:val="24"/>
+              </w:rPr>
+            </w:pPr>
+            <w:r>
+              <w:rPr>
+                <w:sz w:val="24"/>
+                <w:szCs w:val="24"/>
+              </w:rPr>
+              <w:t>X</w:t>
+            </w:r>
+          </w:p>
         </w:tc>
         <w:tc>
           <w:tcPr>
@@ -1455,7 +1560,22 @@
           <w:tcPr>
             <w:tcW w:w="850" w:type="dxa"/>
           </w:tcPr>
-          <w:p/>
+          <w:p>
+            <w:pPr>
+              <w:jc w:val="center"/>
+              <w:rPr>
+                <w:sz w:val="24"/>
+                <w:szCs w:val="24"/>
+              </w:rPr>
+            </w:pPr>
+            <w:r>
+              <w:rPr>
+                <w:sz w:val="24"/>
+                <w:szCs w:val="24"/>
+              </w:rPr>
+              <w:t>X</w:t>
+            </w:r>
+          </w:p>
         </w:tc>
         <w:tc>
           <w:tcPr>
@@ -1497,7 +1617,22 @@
           <w:tcPr>
             <w:tcW w:w="851" w:type="dxa"/>
           </w:tcPr>
-          <w:p/>
+          <w:p>
+            <w:pPr>
+              <w:jc w:val="center"/>
+              <w:rPr>
+                <w:sz w:val="24"/>
+                <w:szCs w:val="24"/>
+              </w:rPr>
+            </w:pPr>
+            <w:r>
+              <w:rPr>
+                <w:sz w:val="24"/>
+                <w:szCs w:val="24"/>
+              </w:rPr>
+              <w:t>X</w:t>
+            </w:r>
+          </w:p>
         </w:tc>
         <w:tc>
           <w:tcPr>
@@ -1582,7 +1717,22 @@
           <w:tcPr>
             <w:tcW w:w="851" w:type="dxa"/>
           </w:tcPr>
-          <w:p/>
+          <w:p>
+            <w:pPr>
+              <w:jc w:val="center"/>
+              <w:rPr>
+                <w:sz w:val="24"/>
+                <w:szCs w:val="24"/>
+              </w:rPr>
+            </w:pPr>
+            <w:r>
+              <w:rPr>
+                <w:sz w:val="24"/>
+                <w:szCs w:val="24"/>
+              </w:rPr>
+              <w:t>X</w:t>
+            </w:r>
+          </w:p>
         </w:tc>
         <w:tc>
           <w:tcPr>
@@ -1618,7 +1768,22 @@
           <w:tcPr>
             <w:tcW w:w="851" w:type="dxa"/>
           </w:tcPr>
-          <w:p/>
+          <w:p>
+            <w:pPr>
+              <w:jc w:val="center"/>
+              <w:rPr>
+                <w:sz w:val="24"/>
+                <w:szCs w:val="24"/>
+              </w:rPr>
+            </w:pPr>
+            <w:r>
+              <w:rPr>
+                <w:sz w:val="24"/>
+                <w:szCs w:val="24"/>
+              </w:rPr>
+              <w:t>X</w:t>
+            </w:r>
+          </w:p>
         </w:tc>
         <w:tc>
           <w:tcPr>
@@ -1648,7 +1813,22 @@
           <w:tcPr>
             <w:tcW w:w="850" w:type="dxa"/>
           </w:tcPr>
-          <w:p/>
+          <w:p>
+            <w:pPr>
+              <w:jc w:val="center"/>
+              <w:rPr>
+                <w:sz w:val="24"/>
+                <w:szCs w:val="24"/>
+              </w:rPr>
+            </w:pPr>
+            <w:r>
+              <w:rPr>
+                <w:sz w:val="24"/>
+                <w:szCs w:val="24"/>
+              </w:rPr>
+              <w:t>X</w:t>
+            </w:r>
+          </w:p>
         </w:tc>
         <w:tc>
           <w:tcPr>
@@ -1739,7 +1919,22 @@
           <w:tcPr>
             <w:tcW w:w="851" w:type="dxa"/>
           </w:tcPr>
-          <w:p/>
+          <w:p>
+            <w:pPr>
+              <w:jc w:val="center"/>
+              <w:rPr>
+                <w:sz w:val="24"/>
+                <w:szCs w:val="24"/>
+              </w:rPr>
+            </w:pPr>
+            <w:r>
+              <w:rPr>
+                <w:sz w:val="24"/>
+                <w:szCs w:val="24"/>
+              </w:rPr>
+              <w:t>X</w:t>
+            </w:r>
+          </w:p>
         </w:tc>
         <w:tc>
           <w:tcPr>
@@ -1769,7 +1964,22 @@
           <w:tcPr>
             <w:tcW w:w="850" w:type="dxa"/>
           </w:tcPr>
-          <w:p/>
+          <w:p>
+            <w:pPr>
+              <w:jc w:val="center"/>
+              <w:rPr>
+                <w:sz w:val="24"/>
+                <w:szCs w:val="24"/>
+              </w:rPr>
+            </w:pPr>
+            <w:r>
+              <w:rPr>
+                <w:sz w:val="24"/>
+                <w:szCs w:val="24"/>
+              </w:rPr>
+              <w:t>X</w:t>
+            </w:r>
+          </w:p>
         </w:tc>
         <w:tc>
           <w:tcPr>
@@ -1811,7 +2021,22 @@
           <w:tcPr>
             <w:tcW w:w="851" w:type="dxa"/>
           </w:tcPr>
-          <w:p/>
+          <w:p>
+            <w:pPr>
+              <w:jc w:val="center"/>
+              <w:rPr>
+                <w:sz w:val="24"/>
+                <w:szCs w:val="24"/>
+              </w:rPr>
+            </w:pPr>
+            <w:r>
+              <w:rPr>
+                <w:sz w:val="24"/>
+                <w:szCs w:val="24"/>
+              </w:rPr>
+              <w:t>X</w:t>
+            </w:r>
+          </w:p>
         </w:tc>
         <w:tc>
           <w:tcPr>
@@ -1850,14 +2075,14 @@
     <w:p>
       <w:pPr>
         <w:rPr>
-          <w:b/>
+          <w:bCs/>
         </w:rPr>
       </w:pPr>
       <w:r>
         <w:rPr>
-          <w:b/>
-        </w:rPr>
-        <w:br/>
+          <w:bCs/>
+        </w:rPr>
+        <w:t xml:space="preserve">We think the report gives a clear and honest picture of the project, both the parts that work well and the things we would do differently. It gets a bit technical in some sections, but we tried to keep the structure easy to follow. Writing it together also helped us agree on how the system actually works.</w:t>
       </w:r>
     </w:p>
     <w:p>

</xml_diff>